<commit_message>
Final report: repository link on page one, and two corrections
The first page now carries the repository link, so the working history is
reachable from the submitted document.

Two corrections: the teammate name reads Nevo Alani, and pipeline is spelled
correctly in the link line. Both had been introduced by hand in an earlier
export; the PDF is now generated straight from the corrected source with no
manual editing.
</commit_message>
<xml_diff>
--- a/deliverables/five_signals_report.docx
+++ b/deliverables/five_signals_report.docx
@@ -48,7 +48,7 @@
         <w:spacing w:after="200" w:line="250" w:lineRule="auto"/>
       </w:pPr>
       <w:r>
-        <w:t>Yaron Besser, ID 324943109        Nevo Aloni, ID 322815820</w:t>
+        <w:t>Yaron Besser, ID 324943109        Nevo Alani, ID 322815820</w:t>
       </w:r>
     </w:p>
     <w:p>
@@ -56,7 +56,7 @@
         <w:spacing w:after="200" w:line="250" w:lineRule="auto"/>
       </w:pPr>
       <w:r>
-        <w:t>Working repository, with the tuning scripts, the per model findings and every query behind the numbers below: github.com/yaron-besser/five-signals</w:t>
+        <w:t>Working repository, with the data loading pipeline, the tuning scripts, the per model findings and every query behind the numbers below: github.com/yaron-besser/five-signals</w:t>
       </w:r>
     </w:p>
     <w:p>

</xml_diff>